<commit_message>
nmctapp reply-brief: regenerate on the model at HEAD; "¶¶ 11–12" now breaks alike, docx gated (XENG pass), latex reported (the ¶ token \mbox drops footnote 8; pass-1 latex render kept) (fb-595.54.54)
Co-Authored-By: Claude Opus 5.5 <noreply@anthropic.com>
</commit_message>
<xml_diff>
--- a/courts/tenth-circuit/new-mexico/state/court-of-appeals/reply-brief/usage/OUTPUT-reply-brief.docx
+++ b/courts/tenth-circuit/new-mexico/state/court-of-appeals/reply-brief/usage/OUTPUT-reply-brief.docx
@@ -3322,7 +3322,7 @@
         <w:pStyle w:val="BodyText"/>
       </w:pPr>
       <w:r>
-        <w:t xml:space="preserve">Plaintiff Districts’ Summary of Facts and Proceedings focuses on the State’s long history of capital outlay, not the State’s current funding system. [AB 2–13] As a result, much of the Factual Summary is out of date and does not reflect recent changes, or even what was presented at the 2019 trial. Most significantly, the impact aid credits described by Plaintiff Districts [AB 4–5 &amp; 7 n.10] were eliminated with the passage of HB 6 in 2021. [BIC 27, 29; 12 RP 2806] Also, Plaintiff Districts’ description of their money available for capital outlay is largely of funding before the State provides additional money. [AB 7–8] The PSCOA and PSCIA help counteract inequalities in property taxation by adjusting the local share of funding based on a district’s property tax base. [BIC 17–18, 22 (citing 11 RP 2688–89, ¶¶ 18, 23 (Zuni has 0% local share, GMCS 18%); 12 RP 2747–48 ¶¶ 11–12 (considers whether property tax revenues sufficient to replace facilities on 45-year schedule)]</w:t>
+        <w:t xml:space="preserve">Plaintiff Districts’ Summary of Facts and Proceedings focuses on the State’s long history of capital outlay, not the State’s current funding system. [AB 2–13] As a result, much of the Factual Summary is out of date and does not reflect recent changes, or even what was presented at the 2019 trial. Most significantly, the impact aid credits described by Plaintiff Districts [AB 4–5 &amp; 7 n.10] were eliminated with the passage of HB 6 in 2021. [BIC 27, 29; 12 RP 2806] Also, Plaintiff Districts’ description of their money available for capital outlay is largely of funding before the State provides additional money. [AB 7–8] The PSCOA and PSCIA help counteract inequalities in property taxation by adjusting the local share of funding based on a district’s property tax base. [BIC 17–18, 22 (citing 11 RP 2688–89, ¶¶ 18, 23 (Zuni has 0% local share, GMCS 18%); 12 RP 2747–48 ¶¶ 11–⁠12 (considers whether property tax revenues sufficient to replace facilities on 45-year schedule)]</w:t>
       </w:r>
     </w:p>
     <w:p>
@@ -3350,7 +3350,7 @@
         <w:pStyle w:val="BodyText"/>
       </w:pPr>
       <w:r>
-        <w:t xml:space="preserve">Nor is there evidence to support Plaintiff Districts’ contention that “poor districts cannot reach adequacy.” [AB 9] Findings of Fact 127–83, to which the Districts cite, contain examples of schools (including some by Plaintiff Districts) being built beyond adequacy standards, not that Plaintiff Districts cannot build schools to adequacy. And Plaintiff Districts’ contention that PSCOC funds have decreased over time [AB 9; 11 RP 2643–46 ¶¶ 347–64] is based on a projection during the 2016 trial that was not substantiated in the 2019 trial with evidence that this funding decrease had transpired. [BIC 23 (citing 11 RP 2698 ¶ 86); see also 5</w:t>
+        <w:t xml:space="preserve">Nor is there evidence to support Plaintiff Districts’ contention that “poor districts cannot reach adequacy.” [AB 9] Findings of Fact 127–83, to which the Districts cite, contain examples of schools (including some by Plaintiff Districts) being built beyond adequacy standards, not that Plaintiff Districts cannot build schools to adequacy. And Plaintiff Districts’ contention that PSCOC funds have decreased over time [AB 9; 11 RP 2643–46 ¶¶ 347–⁠64] is based on a projection during the 2016 trial that was not substantiated in the 2019 trial with evidence that this funding decrease had transpired. [BIC 23 (citing 11 RP 2698 ¶ 86); see also 5</w:t>
       </w:r>
       <w:r>
         <w:noBreakHyphen/>
@@ -3502,7 +3502,7 @@
         <w:t xml:space="preserve"> </w:t>
       </w:r>
       <w:r>
-        <w:t xml:space="preserve">(Wash. 2012) (en banc). In McCleary, the court did not apply strict scrutiny or other levels-of-scrutiny analysis from the equal protection context. Id., ¶¶ 100–102. The District Plaintiffs write that the “State argues against this standard” [AB 16], but the State does not contend that the McCleary framework of placing the burden of proof on Plaintiffs is incorrect. Rather, the State argues that a plaintiff’s burden in bringing a positive rights claim under Article XII should be assessed with the underlying presumption that legislation is constitutional. [See BIC 46–47]; Moses v. Ruszkowski, 2019-NMSC</w:t>
+        <w:t xml:space="preserve">(Wash. 2012) (en banc). In McCleary, the court did not apply strict scrutiny or other levels-of-scrutiny analysis from the equal protection context. Id., ¶¶ 100–⁠102. The District Plaintiffs write that the “State argues against this standard” [AB 16], but the State does not contend that the McCleary framework of placing the burden of proof on Plaintiffs is incorrect. Rather, the State argues that a plaintiff’s burden in bringing a positive rights claim under Article XII should be assessed with the underlying presumption that legislation is constitutional. [See BIC 46–47]; Moses v. Ruszkowski, 2019-NMSC</w:t>
       </w:r>
       <w:r>
         <w:noBreakHyphen/>
@@ -6066,7 +6066,7 @@
         <w:t xml:space="preserve"> </w:t>
       </w:r>
       <w:r>
-        <w:t xml:space="preserve">https://​​www.​nmlegis.​gov/​​Sessions/​​21%20Regular/​​firs/​​HB0006.​PDF (at 4).</w:t>
+        <w:t xml:space="preserve">https://​www.​nmlegis.​gov/​Sessions/​21%20Regular/​firs/​HB0006.​PDF (at 4).</w:t>
       </w:r>
     </w:p>
   </w:footnote>
@@ -7185,6 +7185,33 @@
     <w:pPr>
       <w:spacing w:before="0" w:after="0" w:line="322" w:lineRule="exact"/>
       <w:ind w:left="2160" w:hanging="720"/>
+    </w:pPr>
+  </w:style>
+  <w:style w:type="paragraph" w:customStyle="1" w:styleId="XdQuoteList1">
+    <w:name w:val="Xd Quote List 1"/>
+    <w:basedOn w:val="Normal"/>
+    <w:qFormat/>
+    <w:pPr>
+      <w:spacing w:before="0" w:after="0" w:line="322" w:lineRule="exact"/>
+      <w:ind w:left="1440" w:right="720" w:hanging="720"/>
+    </w:pPr>
+  </w:style>
+  <w:style w:type="paragraph" w:customStyle="1" w:styleId="XdQuoteList2">
+    <w:name w:val="Xd Quote List 2"/>
+    <w:basedOn w:val="Normal"/>
+    <w:qFormat/>
+    <w:pPr>
+      <w:spacing w:before="0" w:after="0" w:line="322" w:lineRule="exact"/>
+      <w:ind w:left="2160" w:right="720" w:hanging="720"/>
+    </w:pPr>
+  </w:style>
+  <w:style w:type="paragraph" w:customStyle="1" w:styleId="XdQuoteList3">
+    <w:name w:val="Xd Quote List 3"/>
+    <w:basedOn w:val="Normal"/>
+    <w:qFormat/>
+    <w:pPr>
+      <w:spacing w:before="0" w:after="0" w:line="322" w:lineRule="exact"/>
+      <w:ind w:left="2880" w:right="720" w:hanging="720"/>
     </w:pPr>
   </w:style>
   <w:style w:type="paragraph" w:customStyle="1" w:styleId="SourceCode">

</xml_diff>